<commit_message>
Align docs with the 7-role model, access hardening and Created column
- UIUX §7: replace the stale 6-row roles table with the PRD's 7-role /
  9-persona model (adds Site Administrator + ABAC scopes), and add a
  "User and access management" subsection (roles, scope, status, creation
  date, access matrix) with a live screenshot.
- PRD: add FR-14a (RBAC+ABAC at collection+field level, admin-only role
  edits / no self-escalation, siteAdmin site-confined) and FR-14b (user
  admin screen with creation date + capability matrix); FR-13 reworded.
- Architecture §10 + Payload posture: note the access model is
  behaviourally verified by a per-role allow/deny suite.
- Rebuilt PDFs (PRD, UIUX, Architecture, Deck, Payload posture) + posture
  .docx; synced to docs/sales and the PDF bundle/zip.

Co-Authored-By: Claude Opus 4.8 (1M context) <noreply@anthropic.com>
</commit_message>
<xml_diff>
--- a/docs/sales/HUMAIN-Create-Studio-Payload-Security-Posture.docx
+++ b/docs/sales/HUMAIN-Create-Studio-Payload-Security-Posture.docx
@@ -787,7 +787,38 @@
               <w:t xml:space="preserve"> </w:t>
             </w:r>
             <w:r>
-              <w:t xml:space="preserve">(site-scope, department, locale) enforced at collection and field level</w:t>
+              <w:t xml:space="preserve">(site-scope, department, locale) enforced at collection and field level; roles/scope admin-editable only (no self-escalation);</w:t>
+            </w:r>
+            <w:r>
+              <w:t xml:space="preserve"> </w:t>
+            </w:r>
+            <w:r>
+              <w:rPr>
+                <w:rStyle w:val="VerbatimChar"/>
+              </w:rPr>
+              <w:t xml:space="preserve">siteAdmin</w:t>
+            </w:r>
+            <w:r>
+              <w:t xml:space="preserve"> </w:t>
+            </w:r>
+            <w:r>
+              <w:t xml:space="preserve">confined to its sites;</w:t>
+            </w:r>
+            <w:r>
+              <w:t xml:space="preserve"> </w:t>
+            </w:r>
+            <w:r>
+              <w:rPr>
+                <w:b/>
+                <w:bCs/>
+              </w:rPr>
+              <w:t xml:space="preserve">behaviourally verified</w:t>
+            </w:r>
+            <w:r>
+              <w:t xml:space="preserve"> </w:t>
+            </w:r>
+            <w:r>
+              <w:t xml:space="preserve">by a per-role allow/deny test suite</w:t>
             </w:r>
           </w:p>
         </w:tc>

</xml_diff>